<commit_message>
AUTO: agent stop 2026-07-23 17:27
</commit_message>
<xml_diff>
--- a/docs/specs/10-landing-audit-and-implementation.docx
+++ b/docs/specs/10-landing-audit-and-implementation.docx
@@ -414,7 +414,7 @@
         <w:pStyle w:val="ListNumber"/>
       </w:pPr>
       <w:r>
-        <w:t>**Главная** — продающий лендинг.</w:t>
+        <w:t>Главная — продающий лендинг.</w:t>
       </w:r>
     </w:p>
     <w:p>
@@ -422,7 +422,7 @@
         <w:pStyle w:val="ListNumber"/>
       </w:pPr>
       <w:r>
-        <w:t>**Как проходит проверка** — подробная инструкция из 5 шагов.</w:t>
+        <w:t>Как проходит проверка — подробная инструкция из 5 шагов.</w:t>
       </w:r>
     </w:p>
     <w:p>
@@ -430,7 +430,7 @@
         <w:pStyle w:val="ListNumber"/>
       </w:pPr>
       <w:r>
-        <w:t>**Услуги и тарифы** — диагностика, сопровождение, успех-вознаграждение.</w:t>
+        <w:t>Услуги и тарифы — диагностика, сопровождение, успех-вознаграждение.</w:t>
       </w:r>
     </w:p>
     <w:p>
@@ -438,7 +438,7 @@
         <w:pStyle w:val="ListNumber"/>
       </w:pPr>
       <w:r>
-        <w:t>**Вопросы и ответы** — отдельная индексируемая FAQ-страница.</w:t>
+        <w:t>Вопросы и ответы — отдельная индексируемая FAQ-страница.</w:t>
       </w:r>
     </w:p>
     <w:p>
@@ -446,7 +446,7 @@
         <w:pStyle w:val="ListNumber"/>
       </w:pPr>
       <w:r>
-        <w:t>**О сервисе / Исполнитель** — кто оказывает услуги и как связаться.</w:t>
+        <w:t>О сервисе / Исполнитель — кто оказывает услуги и как связаться.</w:t>
       </w:r>
     </w:p>
     <w:p>
@@ -454,7 +454,7 @@
         <w:pStyle w:val="ListNumber"/>
       </w:pPr>
       <w:r>
-        <w:t>**Оферта** — только после юридического согласования.</w:t>
+        <w:t>Оферта — только после юридического согласования.</w:t>
       </w:r>
     </w:p>
     <w:p>
@@ -462,7 +462,7 @@
         <w:pStyle w:val="ListNumber"/>
       </w:pPr>
       <w:r>
-        <w:t>**Политика обработки ПДн**.</w:t>
+        <w:t>Политика обработки ПДн.</w:t>
       </w:r>
     </w:p>
     <w:p>
@@ -470,7 +470,7 @@
         <w:pStyle w:val="ListNumber"/>
       </w:pPr>
       <w:r>
-        <w:t>**Согласие на обработку ПДн**.</w:t>
+        <w:t>Согласие на обработку ПДн.</w:t>
       </w:r>
     </w:p>
     <w:p>
@@ -478,7 +478,7 @@
         <w:pStyle w:val="ListNumber"/>
       </w:pPr>
       <w:r>
-        <w:t>**Контакты**.</w:t>
+        <w:t>Контакты.</w:t>
       </w:r>
     </w:p>
     <w:p>
@@ -486,7 +486,7 @@
         <w:pStyle w:val="ListNumber"/>
       </w:pPr>
       <w:r>
-        <w:t>**Блог** — тематические статьи; без обещаний результата и копирования чужих текстов.</w:t>
+        <w:t>Блог — тематические статьи; без обещаний результата и копирования чужих текстов.</w:t>
       </w:r>
     </w:p>
     <w:p>
@@ -1172,7 +1172,7 @@
         <w:pStyle w:val="ListBullet"/>
       </w:pPr>
       <w:r>
-        <w:t>WordPress + Astra + **один** конструктор: Elementor **или** Spectra/Gutenberg. Не ставить оба.</w:t>
+        <w:t>WordPress + Astra + один конструктор: Elementor или Spectra/Gutenberg. Не ставить оба.</w:t>
       </w:r>
     </w:p>
     <w:p>
@@ -1286,7 +1286,7 @@
         <w:pStyle w:val="ListBullet"/>
       </w:pPr>
       <w:r>
-        <w:t>Админка: уникальные пользователи, двухфакторная аутентификация, без общего `admin`.</w:t>
+        <w:t>Админка: уникальные пользователи, двухфакторная аутентификация, без общего admin.</w:t>
       </w:r>
     </w:p>
     <w:p>
@@ -1318,7 +1318,7 @@
         <w:pStyle w:val="ListBullet"/>
       </w:pPr>
       <w:r>
-        <w:t>Не хранить `SUPABASE_SERVICE_ROLE_KEY`, MAX token, ключи Yandex, SSH-ключи в WordPress и браузере.</w:t>
+        <w:t>Не хранить SUPABASE_SERVICE_ROLE_KEY, MAX token, ключи Yandex, SSH-ключи в WordPress и браузере.</w:t>
       </w:r>
     </w:p>
     <w:p>
@@ -1350,7 +1350,7 @@
         <w:pStyle w:val="ListBullet"/>
       </w:pPr>
       <w:r>
-        <w:t>Кабинет: кнопка ведёт на `https://cabinet.домен`; до готовности — скрыта/помечена «Скоро».</w:t>
+        <w:t>Кабинет: кнопка ведёт на https://cabinet.домен; до готовности — скрыта/помечена «Скоро».</w:t>
       </w:r>
     </w:p>
     <w:p>
@@ -1446,7 +1446,7 @@
         <w:pStyle w:val="ListBullet"/>
       </w:pPr>
       <w:r>
-        <w:t>Все изображения имеют `alt`, кнопки — понятные названия, форма — видимые labels.</w:t>
+        <w:t>Все изображения имеют alt, кнопки — понятные названия, форма — видимые labels.</w:t>
       </w:r>
     </w:p>
     <w:p>
@@ -1478,7 +1478,7 @@
         <w:pStyle w:val="ListBullet"/>
       </w:pPr>
       <w:r>
-        <w:t>Schema.org: `Organization`, `WebSite`, `FAQPage`; не использовать `GovernmentOrganization`.</w:t>
+        <w:t>Schema.org: Organization, WebSite, FAQPage; не использовать GovernmentOrganization.</w:t>
       </w:r>
     </w:p>
     <w:p>
@@ -1486,7 +1486,7 @@
         <w:pStyle w:val="ListBullet"/>
       </w:pPr>
       <w:r>
-        <w:t>`sitemap.xml`, robots.txt, Search Console и Яндекс Вебмастер.</w:t>
+        <w:t>sitemap.xml, robots.txt, Search Console и Яндекс Вебмастер.</w:t>
       </w:r>
     </w:p>
     <w:p>

</xml_diff>